<commit_message>
suma pozo 2702 al informe final
</commit_message>
<xml_diff>
--- a/Fundamentos_Aprendizaje - TPF - Detección Temprana de Anomalías en Revestimiento_V1.docx
+++ b/Fundamentos_Aprendizaje - TPF - Detección Temprana de Anomalías en Revestimiento_V1.docx
@@ -123,6 +123,7 @@
                                     <w:dataBinding w:prefixMappings="xmlns:ns0='http://purl.org/dc/elements/1.1/' xmlns:ns1='http://schemas.openxmlformats.org/package/2006/metadata/core-properties' " w:xpath="/ns1:coreProperties[1]/ns0:title[1]" w:storeItemID="{6C3C8BC8-F283-45AE-878A-BAB7291924A1}"/>
                                     <w:text/>
                                   </w:sdtPr>
+                                  <w:sdtEndPr/>
                                   <w:sdtContent>
                                     <w:r>
                                       <w:rPr>
@@ -153,25 +154,7 @@
                                     <w:sz w:val="24"/>
                                     <w:szCs w:val="24"/>
                                   </w:rPr>
-                                  <w:t>Docentes: Hernán Merlino</w:t>
-                                </w:r>
-                                <w:r>
-                                  <w:rPr>
-                                    <w:caps/>
-                                    <w:color w:val="A02B93" w:themeColor="accent5"/>
-                                    <w:sz w:val="24"/>
-                                    <w:szCs w:val="24"/>
-                                  </w:rPr>
-                                  <w:t xml:space="preserve"> -</w:t>
-                                </w:r>
-                                <w:r>
-                                  <w:rPr>
-                                    <w:caps/>
-                                    <w:color w:val="A02B93" w:themeColor="accent5"/>
-                                    <w:sz w:val="24"/>
-                                    <w:szCs w:val="24"/>
-                                  </w:rPr>
-                                  <w:t xml:space="preserve"> Diego Adrián Castro</w:t>
+                                  <w:t>Docentes: Hernán Merlino - Diego Adrián Castro</w:t>
                                 </w:r>
                               </w:p>
                               <w:sdt>
@@ -188,6 +171,7 @@
                                   <w:dataBinding w:prefixMappings="xmlns:ns0='http://purl.org/dc/elements/1.1/' xmlns:ns1='http://schemas.openxmlformats.org/package/2006/metadata/core-properties' " w:xpath="/ns1:coreProperties[1]/ns0:subject[1]" w:storeItemID="{6C3C8BC8-F283-45AE-878A-BAB7291924A1}"/>
                                   <w:text/>
                                 </w:sdtPr>
+                                <w:sdtEndPr/>
                                 <w:sdtContent>
                                   <w:p>
                                     <w:pPr>
@@ -226,6 +210,7 @@
                                   <w:dataBinding w:prefixMappings="xmlns:ns0='http://purl.org/dc/elements/1.1/' xmlns:ns1='http://schemas.openxmlformats.org/package/2006/metadata/core-properties' " w:xpath="/ns1:coreProperties[1]/ns0:creator[1]" w:storeItemID="{6C3C8BC8-F283-45AE-878A-BAB7291924A1}"/>
                                   <w:text/>
                                 </w:sdtPr>
+                                <w:sdtEndPr/>
                                 <w:sdtContent>
                                   <w:p>
                                     <w:pPr>
@@ -320,6 +305,7 @@
                               <w:dataBinding w:prefixMappings="xmlns:ns0='http://purl.org/dc/elements/1.1/' xmlns:ns1='http://schemas.openxmlformats.org/package/2006/metadata/core-properties' " w:xpath="/ns1:coreProperties[1]/ns0:title[1]" w:storeItemID="{6C3C8BC8-F283-45AE-878A-BAB7291924A1}"/>
                               <w:text/>
                             </w:sdtPr>
+                            <w:sdtEndPr/>
                             <w:sdtContent>
                               <w:r>
                                 <w:rPr>
@@ -350,25 +336,7 @@
                               <w:sz w:val="24"/>
                               <w:szCs w:val="24"/>
                             </w:rPr>
-                            <w:t>Docentes: Hernán Merlino</w:t>
-                          </w:r>
-                          <w:r>
-                            <w:rPr>
-                              <w:caps/>
-                              <w:color w:val="A02B93" w:themeColor="accent5"/>
-                              <w:sz w:val="24"/>
-                              <w:szCs w:val="24"/>
-                            </w:rPr>
-                            <w:t xml:space="preserve"> -</w:t>
-                          </w:r>
-                          <w:r>
-                            <w:rPr>
-                              <w:caps/>
-                              <w:color w:val="A02B93" w:themeColor="accent5"/>
-                              <w:sz w:val="24"/>
-                              <w:szCs w:val="24"/>
-                            </w:rPr>
-                            <w:t xml:space="preserve"> Diego Adrián Castro</w:t>
+                            <w:t>Docentes: Hernán Merlino - Diego Adrián Castro</w:t>
                           </w:r>
                         </w:p>
                         <w:sdt>
@@ -385,6 +353,7 @@
                             <w:dataBinding w:prefixMappings="xmlns:ns0='http://purl.org/dc/elements/1.1/' xmlns:ns1='http://schemas.openxmlformats.org/package/2006/metadata/core-properties' " w:xpath="/ns1:coreProperties[1]/ns0:subject[1]" w:storeItemID="{6C3C8BC8-F283-45AE-878A-BAB7291924A1}"/>
                             <w:text/>
                           </w:sdtPr>
+                          <w:sdtEndPr/>
                           <w:sdtContent>
                             <w:p>
                               <w:pPr>
@@ -423,6 +392,7 @@
                             <w:dataBinding w:prefixMappings="xmlns:ns0='http://purl.org/dc/elements/1.1/' xmlns:ns1='http://schemas.openxmlformats.org/package/2006/metadata/core-properties' " w:xpath="/ns1:coreProperties[1]/ns0:creator[1]" w:storeItemID="{6C3C8BC8-F283-45AE-878A-BAB7291924A1}"/>
                             <w:text/>
                           </w:sdtPr>
+                          <w:sdtEndPr/>
                           <w:sdtContent>
                             <w:p>
                               <w:pPr>
@@ -558,6 +528,7 @@
                                     <w:calendar w:val="gregorian"/>
                                   </w:date>
                                 </w:sdtPr>
+                                <w:sdtEndPr/>
                                 <w:sdtContent>
                                   <w:p>
                                     <w:pPr>
@@ -624,6 +595,7 @@
                               <w:calendar w:val="gregorian"/>
                             </w:date>
                           </w:sdtPr>
+                          <w:sdtEndPr/>
                           <w:sdtContent>
                             <w:p>
                               <w:pPr>
@@ -1664,7 +1636,7 @@
     </w:p>
     <w:tbl>
       <w:tblPr>
-        <w:tblW w:w="6760" w:type="dxa"/>
+        <w:tblW w:w="7078" w:type="dxa"/>
         <w:jc w:val="center"/>
         <w:tblCellMar>
           <w:left w:w="0" w:type="dxa"/>
@@ -1675,7 +1647,7 @@
       <w:tblGrid>
         <w:gridCol w:w="1720"/>
         <w:gridCol w:w="2260"/>
-        <w:gridCol w:w="2780"/>
+        <w:gridCol w:w="3098"/>
       </w:tblGrid>
       <w:tr>
         <w:trPr>
@@ -1749,7 +1721,7 @@
         </w:tc>
         <w:tc>
           <w:tcPr>
-            <w:tcW w:w="2780" w:type="dxa"/>
+            <w:tcW w:w="3098" w:type="dxa"/>
             <w:tcBorders>
               <w:top w:val="single" w:sz="8" w:space="0" w:color="FFFFFF"/>
               <w:left w:val="single" w:sz="8" w:space="0" w:color="FFFFFF"/>
@@ -1791,7 +1763,7 @@
             <w:tcBorders>
               <w:top w:val="single" w:sz="24" w:space="0" w:color="FFFFFF"/>
               <w:left w:val="single" w:sz="8" w:space="0" w:color="FFFFFF"/>
-              <w:bottom w:val="single" w:sz="8" w:space="0" w:color="FFFFFF"/>
+              <w:bottom w:val="single" w:sz="24" w:space="0" w:color="FFFFFF"/>
               <w:right w:val="single" w:sz="8" w:space="0" w:color="FFFFFF"/>
             </w:tcBorders>
             <w:shd w:val="clear" w:color="auto" w:fill="CFD9FB"/>
@@ -1821,7 +1793,7 @@
             <w:tcBorders>
               <w:top w:val="single" w:sz="24" w:space="0" w:color="FFFFFF"/>
               <w:left w:val="single" w:sz="8" w:space="0" w:color="FFFFFF"/>
-              <w:bottom w:val="single" w:sz="8" w:space="0" w:color="FFFFFF"/>
+              <w:bottom w:val="single" w:sz="24" w:space="0" w:color="FFFFFF"/>
               <w:right w:val="single" w:sz="8" w:space="0" w:color="FFFFFF"/>
             </w:tcBorders>
             <w:shd w:val="clear" w:color="auto" w:fill="CFD9FB"/>
@@ -1847,11 +1819,11 @@
         </w:tc>
         <w:tc>
           <w:tcPr>
-            <w:tcW w:w="2780" w:type="dxa"/>
+            <w:tcW w:w="3098" w:type="dxa"/>
             <w:tcBorders>
               <w:top w:val="single" w:sz="24" w:space="0" w:color="FFFFFF"/>
               <w:left w:val="single" w:sz="8" w:space="0" w:color="FFFFFF"/>
-              <w:bottom w:val="single" w:sz="8" w:space="0" w:color="FFFFFF"/>
+              <w:bottom w:val="single" w:sz="24" w:space="0" w:color="FFFFFF"/>
               <w:right w:val="single" w:sz="8" w:space="0" w:color="FFFFFF"/>
             </w:tcBorders>
             <w:shd w:val="clear" w:color="auto" w:fill="CFD9FB"/>
@@ -1881,6 +1853,14 @@
               </w:rPr>
               <w:t>3937</w:t>
             </w:r>
+            <w:r>
+              <w:rPr>
+                <w:b/>
+                <w:bCs/>
+                <w:lang w:val="es-ES"/>
+              </w:rPr>
+              <w:t xml:space="preserve"> m</w:t>
+            </w:r>
           </w:p>
           <w:p>
             <w:pPr>
@@ -1898,7 +1878,23 @@
                 <w:bCs/>
                 <w:lang w:val="es-ES"/>
               </w:rPr>
-              <w:t xml:space="preserve">3276 </w:t>
+              <w:t>3276</w:t>
+            </w:r>
+            <w:r>
+              <w:rPr>
+                <w:b/>
+                <w:bCs/>
+                <w:lang w:val="es-ES"/>
+              </w:rPr>
+              <w:t xml:space="preserve"> m</w:t>
+            </w:r>
+            <w:r>
+              <w:rPr>
+                <w:b/>
+                <w:bCs/>
+                <w:lang w:val="es-ES"/>
+              </w:rPr>
+              <w:t xml:space="preserve"> </w:t>
             </w:r>
             <w:r>
               <w:rPr>
@@ -1914,6 +1910,167 @@
               </w:rPr>
               <w:t xml:space="preserve"> 3290</w:t>
             </w:r>
+            <w:r>
+              <w:rPr>
+                <w:b/>
+                <w:bCs/>
+                <w:lang w:val="es-ES"/>
+              </w:rPr>
+              <w:t xml:space="preserve"> m</w:t>
+            </w:r>
+          </w:p>
+        </w:tc>
+      </w:tr>
+      <w:tr>
+        <w:trPr>
+          <w:trHeight w:val="584"/>
+          <w:jc w:val="center"/>
+        </w:trPr>
+        <w:tc>
+          <w:tcPr>
+            <w:tcW w:w="1720" w:type="dxa"/>
+            <w:tcBorders>
+              <w:top w:val="single" w:sz="24" w:space="0" w:color="FFFFFF"/>
+              <w:left w:val="single" w:sz="8" w:space="0" w:color="FFFFFF"/>
+              <w:bottom w:val="single" w:sz="8" w:space="0" w:color="FFFFFF"/>
+              <w:right w:val="single" w:sz="8" w:space="0" w:color="FFFFFF"/>
+            </w:tcBorders>
+            <w:shd w:val="clear" w:color="auto" w:fill="CFD9FB"/>
+            <w:tcMar>
+              <w:top w:w="72" w:type="dxa"/>
+              <w:left w:w="144" w:type="dxa"/>
+              <w:bottom w:w="72" w:type="dxa"/>
+              <w:right w:w="144" w:type="dxa"/>
+            </w:tcMar>
+          </w:tcPr>
+          <w:p>
+            <w:pPr>
+              <w:ind w:left="360"/>
+              <w:rPr>
+                <w:lang w:val="es-419"/>
+              </w:rPr>
+            </w:pPr>
+            <w:r>
+              <w:rPr>
+                <w:lang w:val="es-419"/>
+              </w:rPr>
+              <w:t>2702</w:t>
+            </w:r>
+          </w:p>
+        </w:tc>
+        <w:tc>
+          <w:tcPr>
+            <w:tcW w:w="2260" w:type="dxa"/>
+            <w:tcBorders>
+              <w:top w:val="single" w:sz="24" w:space="0" w:color="FFFFFF"/>
+              <w:left w:val="single" w:sz="8" w:space="0" w:color="FFFFFF"/>
+              <w:bottom w:val="single" w:sz="8" w:space="0" w:color="FFFFFF"/>
+              <w:right w:val="single" w:sz="8" w:space="0" w:color="FFFFFF"/>
+            </w:tcBorders>
+            <w:shd w:val="clear" w:color="auto" w:fill="CFD9FB"/>
+            <w:tcMar>
+              <w:top w:w="72" w:type="dxa"/>
+              <w:left w:w="144" w:type="dxa"/>
+              <w:bottom w:w="72" w:type="dxa"/>
+              <w:right w:w="144" w:type="dxa"/>
+            </w:tcMar>
+          </w:tcPr>
+          <w:p>
+            <w:pPr>
+              <w:ind w:left="360"/>
+              <w:rPr>
+                <w:lang w:val="es-ES"/>
+              </w:rPr>
+            </w:pPr>
+            <w:r>
+              <w:rPr>
+                <w:lang w:val="es-ES"/>
+              </w:rPr>
+              <w:t xml:space="preserve">2702: </w:t>
+            </w:r>
+            <w:r>
+              <w:rPr>
+                <w:lang w:val="es-ES"/>
+              </w:rPr>
+              <w:t>etpas 1</w:t>
+            </w:r>
+          </w:p>
+        </w:tc>
+        <w:tc>
+          <w:tcPr>
+            <w:tcW w:w="3098" w:type="dxa"/>
+            <w:tcBorders>
+              <w:top w:val="single" w:sz="24" w:space="0" w:color="FFFFFF"/>
+              <w:left w:val="single" w:sz="8" w:space="0" w:color="FFFFFF"/>
+              <w:bottom w:val="single" w:sz="8" w:space="0" w:color="FFFFFF"/>
+              <w:right w:val="single" w:sz="8" w:space="0" w:color="FFFFFF"/>
+            </w:tcBorders>
+            <w:shd w:val="clear" w:color="auto" w:fill="CFD9FB"/>
+            <w:tcMar>
+              <w:top w:w="72" w:type="dxa"/>
+              <w:left w:w="144" w:type="dxa"/>
+              <w:bottom w:w="72" w:type="dxa"/>
+              <w:right w:w="144" w:type="dxa"/>
+            </w:tcMar>
+          </w:tcPr>
+          <w:p>
+            <w:pPr>
+              <w:ind w:left="360"/>
+              <w:rPr>
+                <w:b/>
+                <w:bCs/>
+              </w:rPr>
+            </w:pPr>
+            <w:r>
+              <w:rPr>
+                <w:b/>
+                <w:bCs/>
+                <w:lang w:val="es-ES"/>
+              </w:rPr>
+              <w:t>5295 m</w:t>
+            </w:r>
+          </w:p>
+          <w:p>
+            <w:pPr>
+              <w:ind w:left="360"/>
+              <w:rPr>
+                <w:b/>
+                <w:bCs/>
+              </w:rPr>
+            </w:pPr>
+            <w:r>
+              <w:rPr>
+                <w:b/>
+                <w:bCs/>
+                <w:lang w:val="es-ES"/>
+              </w:rPr>
+              <w:t>5289 m</w:t>
+            </w:r>
+          </w:p>
+          <w:p>
+            <w:pPr>
+              <w:ind w:left="360"/>
+              <w:rPr>
+                <w:b/>
+                <w:bCs/>
+              </w:rPr>
+            </w:pPr>
+            <w:r>
+              <w:rPr>
+                <w:b/>
+                <w:bCs/>
+                <w:lang w:val="es-ES"/>
+              </w:rPr>
+              <w:t>5018 m</w:t>
+            </w:r>
+          </w:p>
+          <w:p>
+            <w:pPr>
+              <w:ind w:left="360"/>
+              <w:rPr>
+                <w:lang w:val="es-ES"/>
+              </w:rPr>
+            </w:pPr>
           </w:p>
         </w:tc>
       </w:tr>
@@ -2120,7 +2277,11 @@
         <w:t>unos pocos “puntos calientes” de anomalía</w:t>
       </w:r>
       <w:r>
-        <w:t xml:space="preserve"> fácilmente señalables en un informe. Esto permite a los tomadores de decisión enfocarse en investigar esos puntos específicos.</w:t>
+        <w:t xml:space="preserve"> fácilmente </w:t>
+      </w:r>
+      <w:r>
+        <w:lastRenderedPageBreak/>
+        <w:t>señalables en un informe. Esto permite a los tomadores de decisión enfocarse en investigar esos puntos específicos.</w:t>
       </w:r>
     </w:p>
     <w:p>
@@ -2310,6 +2471,7 @@
           <w:b/>
           <w:bCs/>
         </w:rPr>
+        <w:lastRenderedPageBreak/>
         <w:t>Interfaz de usuario y adopción operativa:</w:t>
       </w:r>
       <w:r>
@@ -2323,11 +2485,7 @@
         <w:t>aplicación amigable</w:t>
       </w:r>
       <w:r>
-        <w:t xml:space="preserve"> para ingenieros en sitio. Los notebooks de visualización interactiva desarrollados (usando Plotly y widgets) son un prototipo; el paso siguiente sería construir un dashboard más </w:t>
-      </w:r>
-      <w:r>
-        <w:lastRenderedPageBreak/>
-        <w:t xml:space="preserve">robusto donde el usuario pueda seleccionar el pozo y ver automáticamente el diagnóstico de anomalías por etapa. Esto facilitaría la </w:t>
+        <w:t xml:space="preserve"> para ingenieros en sitio. Los notebooks de visualización interactiva desarrollados (usando Plotly y widgets) son un prototipo; el paso siguiente sería construir un dashboard más robusto donde el usuario pueda seleccionar el pozo y ver automáticamente el diagnóstico de anomalías por etapa. Esto facilitaría la </w:t>
       </w:r>
       <w:r>
         <w:rPr>
@@ -2460,6 +2618,7 @@
         <w:docPartUnique/>
       </w:docPartObj>
     </w:sdtPr>
+    <w:sdtEndPr/>
     <w:sdtContent>
       <w:p>
         <w:pPr>
@@ -4412,6 +4571,23 @@
       <w14:ligatures w14:val="none"/>
     </w:rPr>
   </w:style>
+  <w:style w:type="paragraph" w:styleId="NormalWeb">
+    <w:name w:val="Normal (Web)"/>
+    <w:basedOn w:val="Normal"/>
+    <w:uiPriority w:val="99"/>
+    <w:semiHidden/>
+    <w:unhideWhenUsed/>
+    <w:rsid w:val="006A798A"/>
+    <w:pPr>
+      <w:spacing w:before="100" w:beforeAutospacing="1" w:after="100" w:afterAutospacing="1" w:line="240" w:lineRule="auto"/>
+    </w:pPr>
+    <w:rPr>
+      <w:rFonts w:ascii="Times New Roman" w:eastAsia="Times New Roman" w:hAnsi="Times New Roman" w:cs="Times New Roman"/>
+      <w:kern w:val="0"/>
+      <w:lang w:eastAsia="es-MX"/>
+      <w14:ligatures w14:val="none"/>
+    </w:rPr>
+  </w:style>
 </w:styles>
 </file>
 

</xml_diff>